<commit_message>
organism IDs, Changed JSON Format, ServerHandler asyncio, started MP
Temp

organism IDs, Changed JSON Format, ServerHandler asyncio, started MP
</commit_message>
<xml_diff>
--- a/documentation/LUNAR_Documentation.docx
+++ b/documentation/LUNAR_Documentation.docx
@@ -3832,9 +3832,9 @@
       <w:pPr>
         <w:pStyle w:val="berschrift2"/>
       </w:pPr>
-      <w:bookmarkStart w:id="35" w:name="_Ref210464602"/>
-      <w:bookmarkStart w:id="36" w:name="_Ref210468443"/>
-      <w:bookmarkStart w:id="37" w:name="_Toc200467197"/>
+      <w:bookmarkStart w:id="35" w:name="_Toc200467197"/>
+      <w:bookmarkStart w:id="36" w:name="_Ref210464602"/>
+      <w:bookmarkStart w:id="37" w:name="_Ref210468443"/>
       <w:r>
         <w:t>Algorithmus und Implementierung</w:t>
       </w:r>
@@ -3844,7 +3844,82 @@
         <w:t>Der verwendete evolutionäre Algorithmus basiert auf RT-NEAT (Real-Time NeuroEvolution of Augmenting Topologies) und bildet die Grundlage für die neuronalen Steuerungsnetze der Organismen. Als Implementationsbasis wurde die Python-Bibliothek neat-python (Version 0.93) eingesetzt. Die Bibliothek stellt die Funktionalität des klassischen NEAT-Algorithmus bereit; im Unterschied zum generationenbasierten NEAT ermöglicht RT-NEAT eine kontinuierliche, echtzeitnahe Adaptation von Netzwerktopologien und Gewichten während der Simulation [1–3].</w:t>
       </w:r>
     </w:p>
-    <w:p/>
+    <w:p>
+      <w:pPr>
+        <w:rPr>
+          <w:color w:val="FF0000"/>
+        </w:rPr>
+      </w:pPr>
+      <w:r>
+        <w:rPr>
+          <w:color w:val="FF0000"/>
+        </w:rPr>
+        <w:t>Noch erklären wie / dass ich den Real Time Teil auf diese Library aufbaue…</w:t>
+      </w:r>
+    </w:p>
+    <w:p>
+      <w:pPr>
+        <w:rPr>
+          <w:color w:val="FF0000"/>
+        </w:rPr>
+      </w:pPr>
+      <w:r>
+        <w:rPr>
+          <w:color w:val="FF0000"/>
+        </w:rPr>
+        <w:t>Schauen in neat-python Docs wegen Zitieren</w:t>
+      </w:r>
+    </w:p>
+    <w:p>
+      <w:pPr>
+        <w:rPr>
+          <w:color w:val="FF0000"/>
+        </w:rPr>
+      </w:pPr>
+    </w:p>
+    <w:p>
+      <w:pPr>
+        <w:rPr>
+          <w:color w:val="FF0000"/>
+          <w:lang w:val="de-AT"/>
+        </w:rPr>
+      </w:pPr>
+      <w:r>
+        <w:rPr>
+          <w:color w:val="FF0000"/>
+          <w:lang w:val="de-AT"/>
+        </w:rPr>
+        <w:t>Ich muss das Orginale NEAT / RT-NEAT auch e</w:t>
+      </w:r>
+      <w:r>
+        <w:rPr>
+          <w:color w:val="FF0000"/>
+          <w:lang w:val="de-AT"/>
+        </w:rPr>
+        <w:t xml:space="preserve">rklären &amp; am besten Gute Abbildungen von den Originalen Papers einbauen / gute Stellen 1 zu 1 kopieren und zitieren.  </w:t>
+      </w:r>
+      <w:r>
+        <w:rPr>
+          <w:color w:val="FF0000"/>
+          <w:lang w:val="de-AT"/>
+        </w:rPr>
+        <w:t>So ca. 1-2 Seiten jeweils</w:t>
+      </w:r>
+      <w:r>
+        <w:rPr>
+          <w:color w:val="FF0000"/>
+          <w:lang w:val="de-AT"/>
+        </w:rPr>
+        <w:t>.</w:t>
+      </w:r>
+    </w:p>
+    <w:p>
+      <w:pPr>
+        <w:rPr>
+          <w:lang w:val="de-AT"/>
+        </w:rPr>
+      </w:pPr>
+    </w:p>
     <w:p>
       <w:r>
         <w:t xml:space="preserve">Für die vorliegenden </w:t>
@@ -4084,6 +4159,7 @@
               <w:jc w:val="left"/>
             </w:pPr>
             <w:r>
+              <w:lastRenderedPageBreak/>
               <w:t>energiness</w:t>
             </w:r>
           </w:p>
@@ -4200,7 +4276,6 @@
               <w:jc w:val="left"/>
             </w:pPr>
             <w:r>
-              <w:lastRenderedPageBreak/>
               <w:t>abs_angle</w:t>
             </w:r>
           </w:p>
@@ -4807,13 +4882,23 @@
         <w:pStyle w:val="Text"/>
       </w:pPr>
       <w:r>
+        <w:lastRenderedPageBreak/>
         <w:t>Für alle Eingangsgrößen ist zu beachten, dass fehlende Wahrnehmungen (z. B. keine Objekte im Sichtfeld) konsistent behandelt und ggf. mit einem definierten Default-Wert (z. B. 1 für „keine Nähe“ bei Distanzen) versehen werden müssen.</w:t>
       </w:r>
     </w:p>
     <w:p>
       <w:pPr>
         <w:pStyle w:val="Text"/>
-      </w:pPr>
+        <w:rPr>
+          <w:color w:val="FF0000"/>
+        </w:rPr>
+      </w:pPr>
+      <w:r>
+        <w:rPr>
+          <w:color w:val="FF0000"/>
+        </w:rPr>
+        <w:t>Tabellen noch beschriften…</w:t>
+      </w:r>
     </w:p>
     <w:p>
       <w:pPr>
@@ -4823,7 +4908,6 @@
         <w:rPr>
           <w:lang w:val="de-AT"/>
         </w:rPr>
-        <w:lastRenderedPageBreak/>
         <w:t>Ausgänge</w:t>
       </w:r>
       <w:r>
@@ -5126,6 +5210,36 @@
     </w:p>
     <w:p>
       <w:pPr>
+        <w:jc w:val="left"/>
+        <w:rPr>
+          <w:color w:val="FF0000"/>
+          <w:lang w:val="de-AT"/>
+        </w:rPr>
+      </w:pPr>
+      <w:r>
+        <w:rPr>
+          <w:color w:val="FF0000"/>
+          <w:lang w:val="de-AT"/>
+        </w:rPr>
+        <w:t>Auch als Tabelle machen =&gt; ist übersichtlicher</w:t>
+      </w:r>
+      <w:r>
+        <w:rPr>
+          <w:color w:val="FF0000"/>
+          <w:lang w:val="de-AT"/>
+        </w:rPr>
+        <w:t xml:space="preserve">, </w:t>
+      </w:r>
+      <w:r>
+        <w:rPr>
+          <w:color w:val="FF0000"/>
+          <w:lang w:val="de-AT"/>
+        </w:rPr>
+        <w:t>noch erklären dass ich in der config alles als eine Ausgangsfunktion machen muss =&gt; deswegen wird das manuell als [0,1] interpretiert. So erklären dass es ein allgemeiner Informatiker der nix mit KI / RT-NEAT zu tun hat</w:t>
+      </w:r>
+    </w:p>
+    <w:p>
+      <w:pPr>
         <w:pStyle w:val="berschrift2"/>
         <w:rPr>
           <w:lang w:val="de-AT"/>
@@ -5155,8 +5269,10 @@
       </w:pPr>
       <w:r>
         <w:rPr>
+          <w:noProof/>
           <w:lang w:val="de-AT"/>
         </w:rPr>
+        <w:lastRenderedPageBreak/>
         <w:drawing>
           <wp:inline distT="0" distB="0" distL="0" distR="0" wp14:anchorId="65248238" wp14:editId="0516E4BD">
             <wp:extent cx="3624987" cy="4413380"/>
@@ -5197,24 +5313,15 @@
     <w:p>
       <w:pPr>
         <w:pStyle w:val="Beschriftung"/>
-        <w:rPr>
-          <w:lang w:val="en-GB"/>
-        </w:rPr>
       </w:pPr>
       <w:bookmarkStart w:id="38" w:name="_Ref217233085"/>
       <w:r>
-        <w:rPr>
-          <w:lang w:val="en-GB"/>
-        </w:rPr>
         <w:t xml:space="preserve">Abbildung </w:t>
       </w:r>
       <w:r>
         <w:fldChar w:fldCharType="begin"/>
       </w:r>
       <w:r>
-        <w:rPr>
-          <w:lang w:val="en-GB"/>
-        </w:rPr>
         <w:instrText xml:space="preserve"> SEQ Abbildung \* ARABIC </w:instrText>
       </w:r>
       <w:r>
@@ -5223,7 +5330,6 @@
       <w:r>
         <w:rPr>
           <w:noProof/>
-          <w:lang w:val="en-GB"/>
         </w:rPr>
         <w:t>1</w:t>
       </w:r>
@@ -5231,9 +5337,6 @@
         <w:fldChar w:fldCharType="end"/>
       </w:r>
       <w:r>
-        <w:rPr>
-          <w:lang w:val="en-GB"/>
-        </w:rPr>
         <w:t>: Fitness Function</w:t>
       </w:r>
       <w:bookmarkEnd w:id="38"/>
@@ -5248,188 +5351,188 @@
         <w:rPr>
           <w:lang w:val="de-AT" w:eastAsia="de-DE"/>
         </w:rPr>
+        <w:t>Noch um eine Erklärung e</w:t>
+      </w:r>
+      <w:r>
+        <w:rPr>
+          <w:lang w:val="de-AT" w:eastAsia="de-DE"/>
+        </w:rPr>
+        <w:t>rgänzen…</w:t>
+      </w:r>
+    </w:p>
+    <w:p>
+      <w:pPr>
+        <w:pStyle w:val="berschrift2"/>
+      </w:pPr>
+      <w:r>
+        <w:t>Einleitung</w:t>
+      </w:r>
+      <w:r>
+        <w:t xml:space="preserve"> (</w:t>
+      </w:r>
+      <w:r>
+        <w:rPr>
+          <w:color w:val="0066FF"/>
+        </w:rPr>
+        <w:t>FV</w:t>
+      </w:r>
+      <w:r>
+        <w:rPr>
+          <w:color w:val="0066FF"/>
+        </w:rPr>
+        <w:t xml:space="preserve"> = Überschrift2</w:t>
+      </w:r>
+      <w:r>
+        <w:t>)</w:t>
+      </w:r>
+      <w:bookmarkEnd w:id="35"/>
+    </w:p>
+    <w:p>
+      <w:pPr>
+        <w:pStyle w:val="Text"/>
+        <w:rPr>
+          <w:color w:val="0066FF"/>
+        </w:rPr>
+      </w:pPr>
+      <w:r>
+        <w:rPr>
+          <w:color w:val="0066FF"/>
+        </w:rPr>
+        <w:t>(</w:t>
+      </w:r>
+      <w:r>
+        <w:rPr>
+          <w:color w:val="0066FF"/>
+        </w:rPr>
+        <w:t>FV</w:t>
+      </w:r>
+      <w:r>
+        <w:rPr>
+          <w:color w:val="0066FF"/>
+        </w:rPr>
+        <w:t xml:space="preserve"> = Text) Einführung in den individuellen Teil der Schüler</w:t>
+      </w:r>
+      <w:r>
+        <w:rPr>
+          <w:color w:val="0066FF"/>
+        </w:rPr>
+        <w:t>:</w:t>
+      </w:r>
+      <w:r>
+        <w:rPr>
+          <w:color w:val="0066FF"/>
+        </w:rPr>
+        <w:t xml:space="preserve">in </w:t>
+      </w:r>
+      <w:r>
+        <w:rPr>
+          <w:color w:val="0066FF"/>
+        </w:rPr>
+        <w:t>.</w:t>
+      </w:r>
+    </w:p>
+    <w:p>
+      <w:pPr>
+        <w:pStyle w:val="Text"/>
+        <w:rPr>
+          <w:color w:val="0066FF"/>
+        </w:rPr>
+      </w:pPr>
+      <w:r>
+        <w:rPr>
+          <w:b/>
+          <w:color w:val="0066FF"/>
+        </w:rPr>
+        <w:t>Hinweis</w:t>
+      </w:r>
+      <w:r>
+        <w:rPr>
+          <w:color w:val="0066FF"/>
+        </w:rPr>
+        <w:t xml:space="preserve">: </w:t>
+      </w:r>
+    </w:p>
+    <w:p>
+      <w:pPr>
+        <w:pStyle w:val="Text"/>
+        <w:rPr>
+          <w:color w:val="0066FF"/>
+        </w:rPr>
+      </w:pPr>
+      <w:r>
+        <w:rPr>
+          <w:color w:val="0066FF"/>
+        </w:rPr>
+        <w:t>Jedes Kapitel der DA beginnt mit der Überschrift1 (Ebene1), davor ist immer ein Abschnittswechsel einzufügen. Damit erhält man einerseits eine gute, übersichtliche Struktur des Dokuments, andererseits kann für jedes Kapitel eine spezifische Kopf- und Fußzeile erstellt werden. In der Kopfzeile steht der Titel des Kapitels</w:t>
+      </w:r>
+      <w:r>
+        <w:rPr>
+          <w:color w:val="0066FF"/>
+        </w:rPr>
+        <w:t xml:space="preserve"> (Mitte)</w:t>
+      </w:r>
+      <w:r>
+        <w:rPr>
+          <w:color w:val="0066FF"/>
+        </w:rPr>
+        <w:t xml:space="preserve">, in der Fußzeile </w:t>
+      </w:r>
+      <w:r>
+        <w:rPr>
+          <w:color w:val="0066FF"/>
+        </w:rPr>
+        <w:t xml:space="preserve">der </w:t>
+      </w:r>
+      <w:r>
+        <w:rPr>
+          <w:color w:val="0066FF"/>
+        </w:rPr>
+        <w:t>Name der Schüler:in</w:t>
+      </w:r>
+      <w:r>
+        <w:rPr>
+          <w:color w:val="0066FF"/>
+        </w:rPr>
+        <w:t xml:space="preserve"> (links)</w:t>
+      </w:r>
+      <w:r>
+        <w:rPr>
+          <w:color w:val="0066FF"/>
+        </w:rPr>
+        <w:t>, Kapitel Nr</w:t>
+      </w:r>
+      <w:r>
+        <w:rPr>
+          <w:color w:val="0066FF"/>
+        </w:rPr>
+        <w:t xml:space="preserve"> (Mitte)</w:t>
+      </w:r>
+      <w:r>
+        <w:rPr>
+          <w:color w:val="0066FF"/>
+        </w:rPr>
+        <w:t>, Seitenzahl</w:t>
+      </w:r>
+      <w:r>
+        <w:rPr>
+          <w:color w:val="0066FF"/>
+        </w:rPr>
+        <w:t xml:space="preserve"> (rechts)</w:t>
+      </w:r>
+      <w:r>
+        <w:rPr>
+          <w:color w:val="0066FF"/>
+        </w:rPr>
+        <w:t>.</w:t>
+      </w:r>
+    </w:p>
+    <w:p>
+      <w:pPr>
+        <w:pStyle w:val="berschrift2"/>
+      </w:pPr>
+      <w:bookmarkStart w:id="39" w:name="_Toc200467198"/>
+      <w:r>
         <w:lastRenderedPageBreak/>
-        <w:t>Noch um eine Erklärung e</w:t>
-      </w:r>
-      <w:r>
-        <w:rPr>
-          <w:lang w:val="de-AT" w:eastAsia="de-DE"/>
-        </w:rPr>
-        <w:t>rgänzen…</w:t>
-      </w:r>
-    </w:p>
-    <w:p>
-      <w:pPr>
-        <w:pStyle w:val="berschrift2"/>
-      </w:pPr>
-      <w:r>
-        <w:t>Einleitung</w:t>
-      </w:r>
-      <w:r>
-        <w:t xml:space="preserve"> (</w:t>
-      </w:r>
-      <w:r>
-        <w:rPr>
-          <w:color w:val="0066FF"/>
-        </w:rPr>
-        <w:t>FV</w:t>
-      </w:r>
-      <w:r>
-        <w:rPr>
-          <w:color w:val="0066FF"/>
-        </w:rPr>
-        <w:t xml:space="preserve"> = Überschrift2</w:t>
-      </w:r>
-      <w:r>
-        <w:t>)</w:t>
-      </w:r>
-      <w:bookmarkEnd w:id="37"/>
-    </w:p>
-    <w:p>
-      <w:pPr>
-        <w:pStyle w:val="Text"/>
-        <w:rPr>
-          <w:color w:val="0066FF"/>
-        </w:rPr>
-      </w:pPr>
-      <w:r>
-        <w:rPr>
-          <w:color w:val="0066FF"/>
-        </w:rPr>
-        <w:t>(</w:t>
-      </w:r>
-      <w:r>
-        <w:rPr>
-          <w:color w:val="0066FF"/>
-        </w:rPr>
-        <w:t>FV</w:t>
-      </w:r>
-      <w:r>
-        <w:rPr>
-          <w:color w:val="0066FF"/>
-        </w:rPr>
-        <w:t xml:space="preserve"> = Text) Einführung in den individuellen Teil der Schüler</w:t>
-      </w:r>
-      <w:r>
-        <w:rPr>
-          <w:color w:val="0066FF"/>
-        </w:rPr>
-        <w:t>:</w:t>
-      </w:r>
-      <w:r>
-        <w:rPr>
-          <w:color w:val="0066FF"/>
-        </w:rPr>
-        <w:t xml:space="preserve">in </w:t>
-      </w:r>
-      <w:r>
-        <w:rPr>
-          <w:color w:val="0066FF"/>
-        </w:rPr>
-        <w:t>.</w:t>
-      </w:r>
-    </w:p>
-    <w:p>
-      <w:pPr>
-        <w:pStyle w:val="Text"/>
-        <w:rPr>
-          <w:color w:val="0066FF"/>
-        </w:rPr>
-      </w:pPr>
-      <w:r>
-        <w:rPr>
-          <w:b/>
-          <w:color w:val="0066FF"/>
-        </w:rPr>
-        <w:t>Hinweis</w:t>
-      </w:r>
-      <w:r>
-        <w:rPr>
-          <w:color w:val="0066FF"/>
-        </w:rPr>
-        <w:t xml:space="preserve">: </w:t>
-      </w:r>
-    </w:p>
-    <w:p>
-      <w:pPr>
-        <w:pStyle w:val="Text"/>
-        <w:rPr>
-          <w:color w:val="0066FF"/>
-        </w:rPr>
-      </w:pPr>
-      <w:r>
-        <w:rPr>
-          <w:color w:val="0066FF"/>
-        </w:rPr>
-        <w:t>Jedes Kapitel der DA beginnt mit der Überschrift1 (Ebene1), davor ist immer ein Abschnittswechsel einzufügen. Damit erhält man einerseits eine gute, übersichtliche Struktur des Dokuments, andererseits kann für jedes Kapitel eine spezifische Kopf- und Fußzeile erstellt werden. In der Kopfzeile steht der Titel des Kapitels</w:t>
-      </w:r>
-      <w:r>
-        <w:rPr>
-          <w:color w:val="0066FF"/>
-        </w:rPr>
-        <w:t xml:space="preserve"> (Mitte)</w:t>
-      </w:r>
-      <w:r>
-        <w:rPr>
-          <w:color w:val="0066FF"/>
-        </w:rPr>
-        <w:t xml:space="preserve">, in der Fußzeile </w:t>
-      </w:r>
-      <w:r>
-        <w:rPr>
-          <w:color w:val="0066FF"/>
-        </w:rPr>
-        <w:t xml:space="preserve">der </w:t>
-      </w:r>
-      <w:r>
-        <w:rPr>
-          <w:color w:val="0066FF"/>
-        </w:rPr>
-        <w:t>Name der Schüler:in</w:t>
-      </w:r>
-      <w:r>
-        <w:rPr>
-          <w:color w:val="0066FF"/>
-        </w:rPr>
-        <w:t xml:space="preserve"> (links)</w:t>
-      </w:r>
-      <w:r>
-        <w:rPr>
-          <w:color w:val="0066FF"/>
-        </w:rPr>
-        <w:t>, Kapitel Nr</w:t>
-      </w:r>
-      <w:r>
-        <w:rPr>
-          <w:color w:val="0066FF"/>
-        </w:rPr>
-        <w:t xml:space="preserve"> (Mitte)</w:t>
-      </w:r>
-      <w:r>
-        <w:rPr>
-          <w:color w:val="0066FF"/>
-        </w:rPr>
-        <w:t>, Seitenzahl</w:t>
-      </w:r>
-      <w:r>
-        <w:rPr>
-          <w:color w:val="0066FF"/>
-        </w:rPr>
-        <w:t xml:space="preserve"> (rechts)</w:t>
-      </w:r>
-      <w:r>
-        <w:rPr>
-          <w:color w:val="0066FF"/>
-        </w:rPr>
-        <w:t>.</w:t>
-      </w:r>
-    </w:p>
-    <w:p>
-      <w:pPr>
-        <w:pStyle w:val="berschrift2"/>
-      </w:pPr>
-      <w:bookmarkStart w:id="39" w:name="_Toc200467198"/>
-      <w:r>
         <w:t>Theoretische Grundlagen</w:t>
       </w:r>
       <w:bookmarkEnd w:id="39"/>
@@ -5752,7 +5855,6 @@
         <w:rPr>
           <w:color w:val="0066FF"/>
         </w:rPr>
-        <w:lastRenderedPageBreak/>
         <w:t>Ist i</w:t>
       </w:r>
       <w:r>
@@ -5970,6 +6072,7 @@
         <w:rPr>
           <w:color w:val="0066FF"/>
         </w:rPr>
+        <w:lastRenderedPageBreak/>
         <w:t>Zweiter Punkt der Liste</w:t>
       </w:r>
     </w:p>
@@ -6274,7 +6377,7 @@
             <v:stroke endcap="round"/>
             <v:path shadowok="f" o:extrusionok="f" fillok="f" insetpenok="f"/>
             <o:lock v:ext="edit" rotation="t" aspectratio="t" verticies="t" text="t" shapetype="t"/>
-            <o:ink i="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" annotation="t"/>
+            <o:ink i="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" annotation="t"/>
           </v:rect>
         </w:pict>
       </w:r>
@@ -6287,7 +6390,7 @@
             <v:stroke endcap="round"/>
             <v:path shadowok="f" o:extrusionok="f" fillok="f" insetpenok="f"/>
             <o:lock v:ext="edit" rotation="t" aspectratio="t" verticies="t" text="t" shapetype="t"/>
-            <o:ink i="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" annotation="t"/>
+            <o:ink i="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" annotation="t"/>
           </v:rect>
         </w:pict>
       </w:r>
@@ -6300,7 +6403,7 @@
             <v:stroke endcap="round"/>
             <v:path shadowok="f" o:extrusionok="f" fillok="f" insetpenok="f"/>
             <o:lock v:ext="edit" rotation="t" aspectratio="t" verticies="t" text="t" shapetype="t"/>
-            <o:ink i="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" annotation="t"/>
+            <o:ink i="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" annotation="t"/>
           </v:rect>
         </w:pict>
       </w:r>
@@ -7542,14 +7645,79 @@
     <w:p>
       <w:pPr>
         <w:rPr>
+          <w:color w:val="FF0000"/>
+          <w:lang w:val="de-AT"/>
+        </w:rPr>
+      </w:pPr>
+      <w:r>
+        <w:rPr>
           <w:lang w:val="en-GB"/>
         </w:rPr>
-      </w:pPr>
-      <w:r>
-        <w:rPr>
-          <w:lang w:val="en-GB"/>
-        </w:rPr>
         <w:fldChar w:fldCharType="end"/>
+      </w:r>
+      <w:r>
+        <w:rPr>
+          <w:color w:val="FF0000"/>
+          <w:lang w:val="de-AT"/>
+        </w:rPr>
+        <w:t xml:space="preserve">Es ist smart bei den Originalen </w:t>
+      </w:r>
+      <w:r>
+        <w:rPr>
+          <w:color w:val="FF0000"/>
+          <w:lang w:val="de-AT"/>
+        </w:rPr>
+        <w:t>NEAT-Papers</w:t>
+      </w:r>
+      <w:r>
+        <w:rPr>
+          <w:color w:val="FF0000"/>
+          <w:lang w:val="de-AT"/>
+        </w:rPr>
+        <w:t xml:space="preserve"> ins Literaturverzeichniss zuschauen für gute Referenzen =&gt; oder auch einfach bei google </w:t>
+      </w:r>
+      <w:r>
+        <w:rPr>
+          <w:color w:val="FF0000"/>
+          <w:lang w:val="de-AT"/>
+        </w:rPr>
+        <w:t xml:space="preserve">scholar </w:t>
+      </w:r>
+      <w:r>
+        <w:rPr>
+          <w:color w:val="FF0000"/>
+          <w:lang w:val="de-AT"/>
+        </w:rPr>
+        <w:t>NEAT eingeben</w:t>
+      </w:r>
+      <w:r>
+        <w:rPr>
+          <w:color w:val="FF0000"/>
+          <w:lang w:val="de-AT"/>
+        </w:rPr>
+        <w:t>. Ich brauch zu 99% keine echten / bezahlten Bücher</w:t>
+      </w:r>
+    </w:p>
+    <w:p>
+      <w:pPr>
+        <w:rPr>
+          <w:color w:val="FF0000"/>
+          <w:lang w:val="de-AT"/>
+        </w:rPr>
+      </w:pPr>
+      <w:r>
+        <w:rPr>
+          <w:color w:val="FF0000"/>
+          <w:lang w:val="de-AT"/>
+        </w:rPr>
+        <w:t xml:space="preserve">Inhaltsverzeichniss noch </w:t>
+      </w:r>
+      <w:r>
+        <w:rPr>
+          <w:color w:val="FF0000"/>
+          <w:lang w:val="de-AT"/>
+        </w:rPr>
+        <w:t>aktualisieren am Ende…</w:t>
       </w:r>
     </w:p>
     <w:p>
@@ -7797,8 +7965,8 @@
         </w:rPr>
         <w:t>Kapitel. Hier werden Datenblätter, große Zeichnungen, Skizzen, Bilder, etc. eingefügt, die im Fließtext der vorigen Kapitel nicht eingefügt werden, da sie dort die Übersichtlichkeit bzw. Struktur dieser Kapitel verschlechtern würden.</w:t>
       </w:r>
-      <w:bookmarkEnd w:id="35"/>
       <w:bookmarkEnd w:id="36"/>
+      <w:bookmarkEnd w:id="37"/>
     </w:p>
     <w:sectPr>
       <w:headerReference w:type="even" r:id="rId50"/>
@@ -14806,6 +14974,7 @@
   <w:style w:type="character" w:default="1" w:styleId="Absatz-Standardschriftart">
     <w:name w:val="Default Paragraph Font"/>
     <w:uiPriority w:val="1"/>
+    <w:semiHidden/>
     <w:unhideWhenUsed/>
   </w:style>
   <w:style w:type="table" w:default="1" w:styleId="NormaleTabelle">
@@ -16640,6 +16809,16 @@
 </file>
 
 <file path=customXml/item1.xml><?xml version="1.0" encoding="utf-8"?>
+<b:Sources xmlns:b="http://schemas.openxmlformats.org/officeDocument/2006/bibliography" xmlns="http://schemas.openxmlformats.org/officeDocument/2006/bibliography" SelectedStyle="\IEEE2006OfficeOnline.xsl" StyleName="IEEE" Version="2006"/>
+</file>
+
+<file path=customXml/item2.xml><?xml version="1.0" encoding="utf-8"?>
+<p:properties xmlns:p="http://schemas.microsoft.com/office/2006/metadata/properties" xmlns:xsi="http://www.w3.org/2001/XMLSchema-instance" xmlns:pc="http://schemas.microsoft.com/office/infopath/2007/PartnerControls">
+  <documentManagement/>
+</p:properties>
+</file>
+
+<file path=customXml/item3.xml><?xml version="1.0" encoding="utf-8"?>
 <?mso-contentType ?>
 <FormTemplates xmlns="http://schemas.microsoft.com/sharepoint/v3/contenttype/forms">
   <Display>DocumentLibraryForm</Display>
@@ -16648,7 +16827,7 @@
 </FormTemplates>
 </file>
 
-<file path=customXml/item2.xml><?xml version="1.0" encoding="utf-8"?>
+<file path=customXml/item4.xml><?xml version="1.0" encoding="utf-8"?>
 <ct:contentTypeSchema xmlns:ct="http://schemas.microsoft.com/office/2006/metadata/contentType" xmlns:ma="http://schemas.microsoft.com/office/2006/metadata/properties/metaAttributes" ct:_="" ma:_="" ma:contentTypeName="Dokument" ma:contentTypeID="0x01010025C71E9534E21E4A9F2CF33BA7DCE92D" ma:contentTypeVersion="3" ma:contentTypeDescription="Ein neues Dokument erstellen." ma:contentTypeScope="" ma:versionID="32b9bbdf2bbf4e0fb27a426421665337">
   <xsd:schema xmlns:xsd="http://www.w3.org/2001/XMLSchema" xmlns:xs="http://www.w3.org/2001/XMLSchema" xmlns:p="http://schemas.microsoft.com/office/2006/metadata/properties" xmlns:ns2="5a9e9855-01b6-487f-b294-67c59083cc31" targetNamespace="http://schemas.microsoft.com/office/2006/metadata/properties" ma:root="true" ma:fieldsID="ec87b9b32475f90c9dbf7ae918480825" ns2:_="">
     <xsd:import namespace="5a9e9855-01b6-487f-b294-67c59083cc31"/>
@@ -16786,17 +16965,24 @@
 </ct:contentTypeSchema>
 </file>
 
-<file path=customXml/item3.xml><?xml version="1.0" encoding="utf-8"?>
-<p:properties xmlns:p="http://schemas.microsoft.com/office/2006/metadata/properties" xmlns:xsi="http://www.w3.org/2001/XMLSchema-instance" xmlns:pc="http://schemas.microsoft.com/office/infopath/2007/PartnerControls">
-  <documentManagement/>
-</p:properties>
+<file path=customXml/itemProps1.xml><?xml version="1.0" encoding="utf-8"?>
+<ds:datastoreItem xmlns:ds="http://schemas.openxmlformats.org/officeDocument/2006/customXml" ds:itemID="{9FB2A5D4-A8D9-4E9C-893C-E79B19A4160D}">
+  <ds:schemaRefs>
+    <ds:schemaRef ds:uri="http://schemas.openxmlformats.org/officeDocument/2006/bibliography"/>
+  </ds:schemaRefs>
+</ds:datastoreItem>
 </file>
 
-<file path=customXml/item4.xml><?xml version="1.0" encoding="utf-8"?>
-<b:Sources xmlns:b="http://schemas.openxmlformats.org/officeDocument/2006/bibliography" xmlns="http://schemas.openxmlformats.org/officeDocument/2006/bibliography" SelectedStyle="\IEEE2006OfficeOnline.xsl" StyleName="IEEE" Version="2006"/>
+<file path=customXml/itemProps2.xml><?xml version="1.0" encoding="utf-8"?>
+<ds:datastoreItem xmlns:ds="http://schemas.openxmlformats.org/officeDocument/2006/customXml" ds:itemID="{CE199482-6225-420D-8982-84EA3B0C446C}">
+  <ds:schemaRefs>
+    <ds:schemaRef ds:uri="http://schemas.microsoft.com/office/2006/metadata/properties"/>
+    <ds:schemaRef ds:uri="http://schemas.microsoft.com/office/infopath/2007/PartnerControls"/>
+  </ds:schemaRefs>
+</ds:datastoreItem>
 </file>
 
-<file path=customXml/itemProps1.xml><?xml version="1.0" encoding="utf-8"?>
+<file path=customXml/itemProps3.xml><?xml version="1.0" encoding="utf-8"?>
 <ds:datastoreItem xmlns:ds="http://schemas.openxmlformats.org/officeDocument/2006/customXml" ds:itemID="{6A655C0C-F4A3-4931-9F7F-84CBD61DCE8F}">
   <ds:schemaRefs>
     <ds:schemaRef ds:uri="http://schemas.microsoft.com/sharepoint/v3/contenttype/forms"/>
@@ -16804,7 +16990,7 @@
 </ds:datastoreItem>
 </file>
 
-<file path=customXml/itemProps2.xml><?xml version="1.0" encoding="utf-8"?>
+<file path=customXml/itemProps4.xml><?xml version="1.0" encoding="utf-8"?>
 <ds:datastoreItem xmlns:ds="http://schemas.openxmlformats.org/officeDocument/2006/customXml" ds:itemID="{4B023D59-82BC-4D0F-A651-C98E01C1F15C}">
   <ds:schemaRefs>
     <ds:schemaRef ds:uri="http://schemas.microsoft.com/office/2006/metadata/contentType"/>
@@ -16820,21 +17006,4 @@
     <ds:schemaRef ds:uri="http://schemas.microsoft.com/internal/obd"/>
   </ds:schemaRefs>
 </ds:datastoreItem>
-</file>
-
-<file path=customXml/itemProps3.xml><?xml version="1.0" encoding="utf-8"?>
-<ds:datastoreItem xmlns:ds="http://schemas.openxmlformats.org/officeDocument/2006/customXml" ds:itemID="{CE199482-6225-420D-8982-84EA3B0C446C}">
-  <ds:schemaRefs>
-    <ds:schemaRef ds:uri="http://schemas.microsoft.com/office/2006/metadata/properties"/>
-    <ds:schemaRef ds:uri="http://schemas.microsoft.com/office/infopath/2007/PartnerControls"/>
-  </ds:schemaRefs>
-</ds:datastoreItem>
-</file>
-
-<file path=customXml/itemProps4.xml><?xml version="1.0" encoding="utf-8"?>
-<ds:datastoreItem xmlns:ds="http://schemas.openxmlformats.org/officeDocument/2006/customXml" ds:itemID="{9FB2A5D4-A8D9-4E9C-893C-E79B19A4160D}">
-  <ds:schemaRefs>
-    <ds:schemaRef ds:uri="http://schemas.openxmlformats.org/officeDocument/2006/bibliography"/>
-  </ds:schemaRefs>
-</ds:datastoreItem>
 </file>
</xml_diff>